<commit_message>
feat(G9): Arduino->ESP-IDF 6.0.1 migration, Wokwi serial assertion GREEN (t_c hit, exit 0)
</commit_message>
<xml_diff>
--- a/docs/M2板级测试报告.docx
+++ b/docs/M2板级测试报告.docx
@@ -1141,7 +1141,7 @@
                 <w:rFonts w:ascii="微软雅黑" w:hAnsi="微软雅黑" w:eastAsia="微软雅黑"/>
                 <w:sz w:val="18"/>
               </w:rPr>
-              <w:t>Wokwi 行为断言</w:t>
+              <w:t>Wokwi 行为断言（ESP-IDF）</w:t>
             </w:r>
           </w:p>
         </w:tc>
@@ -1156,7 +1156,7 @@
                 <w:rFonts w:ascii="微软雅黑" w:hAnsi="微软雅黑" w:eastAsia="微软雅黑"/>
                 <w:sz w:val="18"/>
               </w:rPr>
-              <w:t>⚠️ 阻塞（见第四章）</w:t>
+              <w:t>✅ 串口断言 `t_c` 命中，exit 0；boot 链+应用 JSON 全捕获</w:t>
             </w:r>
           </w:p>
         </w:tc>
@@ -1171,7 +1171,7 @@
                 <w:rFonts w:ascii="微软雅黑" w:hAnsi="微软雅黑" w:eastAsia="微软雅黑"/>
                 <w:sz w:val="18"/>
               </w:rPr>
-              <w:t>—</w:t>
+              <w:t>A</w:t>
             </w:r>
           </w:p>
         </w:tc>
@@ -1186,7 +1186,7 @@
                 <w:rFonts w:ascii="微软雅黑" w:hAnsi="微软雅黑" w:eastAsia="微软雅黑"/>
                 <w:sz w:val="18"/>
               </w:rPr>
-              <w:t>wokwi_serial.log</w:t>
+              <w:t>notes/m1-evidence/wokwi_idf_serial.log</w:t>
             </w:r>
           </w:p>
         </w:tc>
@@ -1292,7 +1292,7 @@
           <w:rFonts w:ascii="微软雅黑" w:hAnsi="微软雅黑" w:eastAsia="微软雅黑"/>
           <w:sz w:val="32"/>
         </w:rPr>
-        <w:t>四、已知限制与阻塞项（证据分级 C）</w:t>
+        <w:t>四、已知限制与遗留项</w:t>
       </w:r>
     </w:p>
     <w:p>
@@ -1305,14 +1305,34 @@
           <w:b/>
           <w:sz w:val="21"/>
         </w:rPr>
-        <w:t>G9 行为断言未闭环</w:t>
+        <w:t>固件框架已迁移至 ESP-IDF 6.0.1</w:t>
       </w:r>
       <w:r>
         <w:rPr>
           <w:rFonts w:ascii="微软雅黑" w:hAnsi="微软雅黑" w:eastAsia="微软雅黑"/>
           <w:sz w:val="21"/>
         </w:rPr>
-        <w:t>：Wokwi CLI 对 C3 板需设 serialInterface=USB_SERIAL_JTAG 方可见串口（boot 链路已验证至 app 入口），但 Arduino HWCDC 应用层日志仍不被捕获；且 SHT31 零件不在 CLI 注册表。备选方案：改用 ESP-IDF 框架重试，或降级为"单测 A 级 + 上电实测 C 级"。</w:t>
+        <w:t>（原 Arduino 版因 Wokwi×C3 应用层串口不可捕获而弃用）。迁移后 G9 断言全绿：`{"seq":1,"t_c":25.10,"rh":51.0}` 命中。</w:t>
+      </w:r>
+    </w:p>
+    <w:p>
+      <w:pPr>
+        <w:pStyle w:val="ListNumber"/>
+      </w:pPr>
+      <w:r>
+        <w:rPr>
+          <w:rFonts w:ascii="微软雅黑" w:hAnsi="微软雅黑" w:eastAsia="微软雅黑"/>
+          <w:b/>
+          <w:sz w:val="21"/>
+        </w:rPr>
+        <w:t>仿真传感器为桩</w:t>
+      </w:r>
+      <w:r>
+        <w:rPr>
+          <w:rFonts w:ascii="微软雅黑" w:hAnsi="微软雅黑" w:eastAsia="微软雅黑"/>
+          <w:sz w:val="21"/>
+        </w:rPr>
+        <w:t>（SIM_STUB_SENSOR）：Wokwi CLI 注册表无 SHT31 零件，行为断言验证的是"固件管线/JSON/时序"（A 级）；I2C 协议层由 host 单测覆盖（A 级）；真实传感器读数待上板实测（C 级）。</w:t>
       </w:r>
     </w:p>
     <w:p>
@@ -1332,7 +1352,7 @@
           <w:rFonts w:ascii="微软雅黑" w:hAnsi="微软雅黑" w:eastAsia="微软雅黑"/>
           <w:sz w:val="21"/>
         </w:rPr>
-        <w:t>：本报告全部结论基于机器检查（A/B 级）；上电、无线距离、功耗等 C 级项目待打板回件后人工实测。</w:t>
+        <w:t>：上电、BLE 距离、功耗等 C 级项目待打板回件后人工实测。</w:t>
       </w:r>
     </w:p>
     <w:p>
@@ -1344,7 +1364,7 @@
           <w:rFonts w:ascii="微软雅黑" w:hAnsi="微软雅黑" w:eastAsia="微软雅黑"/>
           <w:sz w:val="21"/>
         </w:rPr>
-        <w:t>freerouting 匿名遥测在墙内环境会拖住进程不退出，已用 Java 代理参数拦截（详见踩坑日记）。</w:t>
+        <w:t>freerouting 匿名遥测在墙内环境拖住进程，已用 Java 代理参数拦截（tools 内链式命令已内置）。</w:t>
       </w:r>
     </w:p>
     <w:p>

</xml_diff>